<commit_message>
Align feed-versus-bolus statements with the M3 results and the Xmax prior with its units
</commit_message>
<xml_diff>
--- a/capsid/docs/CAPSID_results_interpretation.docx
+++ b/capsid/docs/CAPSID_results_interpretation.docx
@@ -3490,7 +3490,7 @@
         <w:pStyle w:val="BodyText"/>
       </w:pPr>
       <w:r>
-        <w:t xml:space="preserve">Feeding versus bolus addition separates two effects that push yield in opposite directions. A bolus at</w:t>
+        <w:t xml:space="preserve">Feeding and bolus addition of the same total dimer give different stalled fractions and different capsid fractions at 18 h. A bolus at</w:t>
       </w:r>
       <w:r>
         <w:t xml:space="preserve"> </w:t>
@@ -3513,7 +3513,7 @@
         <w:t xml:space="preserve"> </w:t>
       </w:r>
       <w:r>
-        <w:t xml:space="preserve">reaches a capsid fraction of 0.884 with 0.8% stalled intermediates; a constant feed reaches 0.741 with 4.0% stalled; a ramped feed reaches 0.728 with 4.4%. Feeding reduces the trapped fraction relative to a bolus of the same total material but leaves 131–137 µM of free dimer unconverted at harvest.</w:t>
+        <w:t xml:space="preserve">reaches a capsid fraction of 0.884 with 0.8% stalled intermediates; a constant feed reaches 0.741 with 4.0% stalled; a ramped feed reaches 0.728 with 4.4%. Feeding therefore does not reduce the trapped fraction relative to a bolus of the same total material, and 131–137 µM of free dimer remains unconverted at harvest.</w:t>
       </w:r>
       <w:r>
         <w:t xml:space="preserve"> </w:t>
@@ -3525,7 +3525,7 @@
         <w:t xml:space="preserve"> </w:t>
       </w:r>
       <w:r>
-        <w:t xml:space="preserve">is true for the intermediate fraction and false for total capsid at 18 h.</w:t>
+        <w:t xml:space="preserve">is false in this model for both the intermediate fraction and the total capsid at 18 h.</w:t>
       </w:r>
     </w:p>
     <w:p>

</xml_diff>